<commit_message>
docs: approve tokenized employee invitations
</commit_message>
<xml_diff>
--- a/docs/Quantitative_Survey_Platform_PRD_v1.0.docx
+++ b/docs/Quantitative_Survey_Platform_PRD_v1.0.docx
@@ -30,6 +30,15 @@
       </w:pPr>
       <w:r>
         <w:t>Status: Approved for implementation | Date: 25 August 2026</w:t>
+      </w:r>
+    </w:p>
+    <w:p>
+      <w:pPr/>
+      <w:r>
+        <w:rPr>
+          <w:i/>
+        </w:rPr>
+        <w:t>Approved post-v1.0 amendment — 27 August 2026: employee onboarding uses a 72-hour, one-time tokenized invitation while preserving Admin-controlled exact email and role assignment.</w:t>
       </w:r>
     </w:p>
     <w:p>
@@ -108,7 +117,15 @@
     </w:p>
     <w:p>
       <w:r>
-        <w:t>The platform has exactly three roles. Admin assigns the role before registration by adding the exact employee email to an allowlist/invitation.</w:t>
+        <w:t>The platform has exactly three roles. Admin assigns the role before registration through an exact-email, tokenized invitation.</w:t>
+      </w:r>
+    </w:p>
+    <w:p>
+      <w:pPr>
+        <w:pStyle w:val="ListBullet"/>
+      </w:pPr>
+      <w:r>
+        <w:t>Admin enters an exact email and assigns PRODUCT_MANAGER, RESEARCHER, or ADMIN. There is no employee-domain restriction in the MVP.</w:t>
       </w:r>
     </w:p>
     <w:tbl>
@@ -602,7 +619,7 @@
         <w:pStyle w:val="ListBullet"/>
       </w:pPr>
       <w:r>
-        <w:t>Admin enters an exact email and assigns PRODUCT_MANAGER, RESEARCHER, or ADMIN.</w:t>
+        <w:t>The system sends /accept-invitation?token=... using a cryptographically secure, single-use invitation token that expires after 72 hours; only its hash is stored.</w:t>
       </w:r>
     </w:p>
     <w:p>
@@ -610,7 +627,7 @@
         <w:pStyle w:val="ListBullet"/>
       </w:pPr>
       <w:r>
-        <w:t>Employee registers with that exact email and creates a password. The user cannot select or alter their role.</w:t>
+        <w:t>The invitation page displays the invited email as read-only. The employee supplies display name and password only and cannot select or alter email or role.</w:t>
       </w:r>
     </w:p>
     <w:p>
@@ -626,6 +643,22 @@
         <w:pStyle w:val="ListBullet"/>
       </w:pPr>
       <w:r>
+        <w:t>Acceptance atomically verifies and consumes the invitation, creates the employee and credential using the Admin-assigned email and role, and prevents token reuse.</w:t>
+      </w:r>
+    </w:p>
+    <w:p>
+      <w:pPr>
+        <w:pStyle w:val="ListBullet"/>
+      </w:pPr>
+      <w:r>
+        <w:t>Admin may resend an INVITED invitation. Resend rotates the token, resets expiry to 72 hours, and invalidates the old link immediately. Expired invitations remain INVITED but cannot be accepted.</w:t>
+      </w:r>
+    </w:p>
+    <w:p>
+      <w:pPr>
+        <w:pStyle w:val="ListBullet"/>
+      </w:pPr>
+      <w:r>
         <w:t>Only Admin can change roles or disable/re-enable employees. Role changes are audited and invalidate existing sessions.</w:t>
       </w:r>
     </w:p>
@@ -634,7 +667,15 @@
         <w:pStyle w:val="ListBullet"/>
       </w:pPr>
       <w:r>
-        <w:t>Maximum 15 ACTIVE registered employees. Disabled employees do not count toward the limit.</w:t>
+        <w:t>Maximum 15 ACTIVE registered employees. INVITED invitations and disabled employees do not count toward the limit.</w:t>
+      </w:r>
+    </w:p>
+    <w:p>
+      <w:pPr>
+        <w:pStyle w:val="ListBullet"/>
+      </w:pPr>
+      <w:r>
+        <w:t>No last-Admin safeguard is included in the MVP; it is a possible future hardening item.</w:t>
       </w:r>
     </w:p>
     <w:p>
@@ -1780,6 +1821,22 @@
         <w:pStyle w:val="ListBullet"/>
       </w:pPr>
       <w:r>
+        <w:t>Employee invitation tokens are 256-bit random values stored only as hashes, expire after 72 hours, are single-use, and are never persisted or logged in plaintext.</w:t>
+      </w:r>
+    </w:p>
+    <w:p>
+      <w:pPr>
+        <w:pStyle w:val="ListBullet"/>
+      </w:pPr>
+      <w:r>
+        <w:t>Invitation acceptance resolves email and assigned role server-side and transactionally creates the User and credential, links and consumes the invitation, enforces the active-employee limit, and writes a safe audit event.</w:t>
+      </w:r>
+    </w:p>
+    <w:p>
+      <w:pPr>
+        <w:pStyle w:val="ListBullet"/>
+      </w:pPr>
+      <w:r>
         <w:t>HTTPS/TLS is required for browser-app, app-database and app-email-provider communication.</w:t>
       </w:r>
     </w:p>
@@ -2137,13 +2194,13 @@
     </w:p>
     <w:p>
       <w:r>
-        <w:rPr>
-          <w:b/>
-        </w:rPr>
-        <w:t xml:space="preserve">☐ </w:t>
+        <w:t>☐ Admin can invite an employee by exact email and assigned role through a 72-hour, single-use link; acceptance cannot change email or role.</w:t>
       </w:r>
+    </w:p>
+    <w:p>
+      <w:pPr/>
       <w:r>
-        <w:t>Admin can invite an employee by exact email and assign one of three roles.</w:t>
+        <w:t>☐ Invitation tokens are stored hash-only; resend invalidates the old link; expired, consumed and disabled invitations cannot be accepted.</w:t>
       </w:r>
     </w:p>
     <w:p>

</xml_diff>

<commit_message>
Replace Resend with Brevo Free transactional email
</commit_message>
<xml_diff>
--- a/docs/Quantitative_Survey_Platform_PRD_v1.0.docx
+++ b/docs/Quantitative_Survey_Platform_PRD_v1.0.docx
@@ -2037,7 +2037,7 @@
         <w:pStyle w:val="ListBullet"/>
       </w:pPr>
       <w:r>
-        <w:t>Employee transactional email: Resend Free.</w:t>
+        <w:t>Employee transactional email: Brevo Free (300 account-wide sends per day), using an individually verified sender; compliant sender rewriting and Brevo branding are accepted, and no company-controlled sending domain is required.</w:t>
       </w:r>
     </w:p>
     <w:p>
@@ -2045,7 +2045,7 @@
         <w:pStyle w:val="ListBullet"/>
       </w:pPr>
       <w:r>
-        <w:t>Respondent survey data must not be sent to Resend, analytics SaaS, AI providers or session-replay services.</w:t>
+        <w:t>Respondent survey data must not be sent to Brevo, analytics SaaS, AI providers or session-replay services.</w:t>
       </w:r>
     </w:p>
     <w:p>

</xml_diff>